<commit_message>
Add new template, language
</commit_message>
<xml_diff>
--- a/template/LOD/LOD_Template.docx
+++ b/template/LOD/LOD_Template.docx
@@ -64,136 +64,8 @@
 </cp:coreProperties>
 </file>
 
-<file path=word\document.xml><?xml version="1.0" encoding="utf-8"?>
-<w:document xmlns:wpc="http://schemas.microsoft.com/office/word/2010/wordprocessingCanvas" xmlns:mo="http://schemas.microsoft.com/office/mac/office/2008/main" xmlns:mc="http://schemas.openxmlformats.org/markup-compatibility/2006" xmlns:mv="urn:schemas-microsoft-com:mac:vml" xmlns:o="urn:schemas-microsoft-com:office:office" xmlns:r="http://schemas.openxmlformats.org/officeDocument/2006/relationships" xmlns:m="http://schemas.openxmlformats.org/officeDocument/2006/math" xmlns:v="urn:schemas-microsoft-com:vml" xmlns:wp14="http://schemas.microsoft.com/office/word/2010/wordprocessingDrawing" xmlns:wp="http://schemas.openxmlformats.org/drawingml/2006/wordprocessingDrawing" xmlns:w10="urn:schemas-microsoft-com:office:word" xmlns:w="http://schemas.openxmlformats.org/wordprocessingml/2006/main" xmlns:w14="http://schemas.microsoft.com/office/word/2010/wordml" xmlns:wpg="http://schemas.microsoft.com/office/word/2010/wordprocessingGroup" xmlns:wpi="http://schemas.microsoft.com/office/word/2010/wordprocessingInk" xmlns:wne="http://schemas.microsoft.com/office/word/2006/wordml" xmlns:wps="http://schemas.microsoft.com/office/word/2010/wordprocessingShape" mc:Ignorable="w14 wp14">
-  <w:body>
-    <w:p>
-      <w:pPr>
-        <w:jc w:val="right"/>
-      </w:pPr>
-      <w:r>
-        <w:rPr>
-          <w:b/>
-        </w:rPr>
-        <w:t>{{date}}</w:t>
-      </w:r>
-    </w:p>
-    <w:p>
-      <w:r>
-        <w:t>{{senderName}}</w:t>
-      </w:r>
-    </w:p>
-    <w:p>
-      <w:r>
-        <w:t>{{senderAddress}}</w:t>
-      </w:r>
-    </w:p>
-    <w:p>
-      <w:r>
-        <w:t>{{senderAddress}}</w:t>
-      </w:r>
-    </w:p>
-    <w:p>
-      <w:r>
-        <w:t>Tel: {{YourCompanyPhone}}  |  Email: {{YourCompanyEmail}}</w:t>
-      </w:r>
-    </w:p>
-    <w:p/>
-    <w:p>
-      <w:r>
-        <w:rPr>
-          <w:b/>
-        </w:rPr>
-        <w:t>{{recipientName}}</w:t>
-      </w:r>
-    </w:p>
-    <w:p>
-      <w:r>
-        <w:t>{{RecipientCompanyName}}</w:t>
-      </w:r>
-    </w:p>
-    <w:p>
-      <w:r>
-        <w:t>{{recipientAddress}}</w:t>
-      </w:r>
-    </w:p>
-    <w:p>
-      <w:r>
-        <w:t>{{recipientAddress}}</w:t>
-      </w:r>
-    </w:p>
-    <w:p>
-      <w:pPr>
-        <w:jc w:val="left"/>
-      </w:pPr>
-      <w:r>
-        <w:rPr>
-          <w:b/>
-          <w:sz w:val="26"/>
-        </w:rPr>
-        <w:t>LETTER OF DEMAND: {{subject}}</w:t>
-      </w:r>
-    </w:p>
-    <w:p>
-      <w:r>
-        <w:t>Dear {{RecipientSalutation}},</w:t>
-      </w:r>
-    </w:p>
-    <w:p>
-      <w:r>
-        <w:t>We refer to the outstanding sum of {{Currency}} {{AmountDue}} owing to {{senderName}} for {{body}} under {{AgreementType}} dated {{AgreementDate}} (Invoice: {{InvoiceNumber}}; Due date: {{DueDate}}).</w:t>
-      </w:r>
-    </w:p>
-    <w:p>
-      <w:r>
-        <w:t>Despite our previous reminders dated {{ReminderDates}}, the above amount remains unpaid. This letter serves as a formal demand for payment of the full outstanding balance within {{PaymentWindowDays}} days from the date of this letter (i.e., on or before {{FinalPaymentDate}}).</w:t>
-      </w:r>
-    </w:p>
-    <w:p>
-      <w:r>
-        <w:t>If we do not receive payment by the deadline, we are instructed to commence recovery actions without further notice, which may include suspension of services and/or legal proceedings. You will be liable for all additional costs, interest, and expenses incurred.</w:t>
-      </w:r>
-    </w:p>
-    <w:p>
-      <w:r>
-        <w:t>Please arrange payment to {{PaymentInstructions}} and email the remittance advice to {{RemittanceEmail}}. If you dispute any part of this demand, contact {{senderName}} at {{ContactPhone}} / {{ContactEmail}} within {{DisputeWindowDays}} days.</w:t>
-      </w:r>
-    </w:p>
-    <w:p>
-      <w:r>
-        <w:t>This letter is issued without prejudice to our clientâ€™s rights and remedies, all of which are expressly reserved.</w:t>
-      </w:r>
-    </w:p>
-    <w:p/>
-    <w:p>
-      <w:r>
-        <w:t>Yours faithfully,</w:t>
-      </w:r>
-    </w:p>
-    <w:p>
-      <w:r>
-        <w:t>{{senderName}}</w:t>
-      </w:r>
-    </w:p>
-    <w:p>
-      <w:r>
-        <w:t>{{YourSignerTitle}}</w:t>
-      </w:r>
-    </w:p>
-    <w:p/>
-    <w:p>
-      <w:r>
-        <w:t>**Automated document** â€” populated from system inputs. Please verify all details before sending.</w:t>
-      </w:r>
-    </w:p>
-    <w:sectPr>
-      <w:pgSz w:w="12240" w:h="15840"/>
-      <w:pgMar w:top="1440" w:right="1800" w:bottom="1440" w:left="1800" w:header="720" w:footer="720" w:gutter="0"/>
-      <w:cols w:space="720"/>
-      <w:docGrid w:linePitch="360"/>
-    </w:sectPr>
-  </w:body>
-</w:document>
+<file path=word\document.xml><?xml version='1.0' encoding='UTF-8' standalone='yes'?>
+<w:document xmlns:wpc="http://schemas.microsoft.com/office/word/2010/wordprocessingCanvas" xmlns:mo="http://schemas.microsoft.com/office/mac/office/2008/main" xmlns:mc="http://schemas.openxmlformats.org/markup-compatibility/2006" xmlns:mv="urn:schemas-microsoft-com:mac:vml" xmlns:o="urn:schemas-microsoft-com:office:office" xmlns:r="http://schemas.openxmlformats.org/officeDocument/2006/relationships" xmlns:m="http://schemas.openxmlformats.org/officeDocument/2006/math" xmlns:v="urn:schemas-microsoft-com:vml" xmlns:wp14="http://schemas.microsoft.com/office/word/2010/wordprocessingDrawing" xmlns:wp="http://schemas.openxmlformats.org/drawingml/2006/wordprocessingDrawing" xmlns:w10="urn:schemas-microsoft-com:office:word" xmlns:w="http://schemas.openxmlformats.org/wordprocessingml/2006/main" xmlns:w14="http://schemas.microsoft.com/office/word/2010/wordml" xmlns:wpg="http://schemas.microsoft.com/office/word/2010/wordprocessingGroup" xmlns:wpi="http://schemas.microsoft.com/office/word/2010/wordprocessingInk" xmlns:wne="http://schemas.microsoft.com/office/word/2006/wordml" xmlns:wps="http://schemas.microsoft.com/office/word/2010/wordprocessingShape" mc:Ignorable="w14 wp14"><w:body><w:p><w:r><w:t>{{date}}</w:t></w:r></w:p> <w:p><w:r><w:t>{{senderName}}</w:t></w:r></w:p> <w:p><w:r><w:t>{{senderAddress}}</w:t></w:r></w:p> <w:p><w:r><w:t>{{senderAddress}}</w:t></w:r></w:p> <w:p><w:r><w:t>Tel: {{YourCompanyPhone}} | Email: {{YourCompanyEmail}}</w:t></w:r></w:p> <w:p><w:r><w:t></w:t></w:r></w:p> <w:p><w:r><w:t>{{recipientName}}</w:t></w:r></w:p> <w:p><w:r><w:t>{{RecipientCompanyName}}</w:t></w:r></w:p> <w:p><w:r><w:t>{{recipientAddress}}</w:t></w:r></w:p> <w:p><w:r><w:t>{{recipientAddress}}</w:t></w:r></w:p> <w:p><w:r><w:t></w:t></w:r></w:p> <w:p><w:r><w:t>Ruj: {{subject}}</w:t></w:r></w:p> <w:p><w:r><w:t>PER: SURAT TUNTUTAN</w:t></w:r></w:p> <w:p><w:r><w:t></w:t></w:r></w:p> <w:p><w:r><w:t>TANPA PREJUDIS</w:t></w:r></w:p> <w:p><w:r><w:t></w:t></w:r></w:p> <w:p><w:r><w:t>Tuan/Puan,</w:t></w:r></w:p> <w:p><w:r><w:t></w:t></w:r></w:p> <w:p><w:r><w:t>Merujuk kepada perkara di atas di mana kami bertindak bagi pihak {{ClientName}} (&quot;&quot;Anakguam kami&quot;&quot;) yang mempunyai alamat penyampaian di {{ClientServiceAddress}}.</w:t></w:r></w:p> <w:p><w:r><w:t></w:t></w:r></w:p> <w:p><w:r><w:t>Adalah dimaklumkan bahawa pihak kami telah diarahkan oleh Anakguam kami untuk menyatakan seperti berikut:</w:t></w:r></w:p> <w:p><w:r><w:t></w:t></w:r></w:p> <w:p><w:r><w:t>{{BackgroundFacts}}</w:t></w:r></w:p> <w:p><w:r><w:t></w:t></w:r></w:p> <w:p><w:r><w:t>Penyebaran fitnah oleh Tuan/Puan ke atas Anakguam kami adalah seperti berikut:</w:t></w:r></w:p> <w:p><w:r><w:t></w:t></w:r></w:p> <w:p><w:r><w:t>{{DefamationActs}}</w:t></w:r></w:p> <w:p><w:r><w:t></w:t></w:r></w:p> <w:p><w:r><w:t>Kenyataan-kenyataan fitnah pihak Tuan/Puan adalah seperti berikut:</w:t></w:r></w:p> <w:p><w:r><w:t></w:t></w:r></w:p> <w:p><w:r><w:t>{{DefamatoryStatementsDetails}}</w:t></w:r></w:p> <w:p><w:r><w:t></w:t></w:r></w:p> <w:p><w:r><w:t>Di dalam gambar atau bahan media yang dimuat naik bersama kenyataan tersebut:</w:t></w:r></w:p> <w:p><w:r><w:t></w:t></w:r></w:p> <w:p><w:r><w:t>{{ImageUploadDetails}}</w:t></w:r></w:p> <w:p><w:r><w:t></w:t></w:r></w:p> <w:p><w:r><w:t>{{AdditionalPublicationDetails}}</w:t></w:r></w:p> <w:p><w:r><w:t></w:t></w:r></w:p> <w:p><w:r><w:t>{{ReshareDetails}}</w:t></w:r></w:p> <w:p><w:r><w:t></w:t></w:r></w:p> <w:p><w:r><w:t>SILA AMBIL PERHATIAN, oleh kerana pihak Tuan/Puan telah membuat Pernyataan-Pernyataan Fitnah tersebut kepada Anakguam kami, MAKA kami dengan ini diarahkan oleh Anakguam kami supaya membuat TUNTUTAN TERHADAP PIHAK TUAN/PUAN dan DENGAN INI KAMI MENUNTUT pihak Tuan/Puan seperti berikut:</w:t></w:r></w:p> <w:p><w:r><w:t></w:t></w:r></w:p> <w:p><w:r><w:t>i. Dalam masa {{PaymentWindowDays}} hari dari tarikh surat ini pihak Tuan/Puan memadam kesemua kenyataan yang mengandungi Pernyataan-Pernyataan Fitnah tersebut yang ditujukan kepada Anakguam kami.</w:t></w:r></w:p> <w:p><w:r><w:t></w:t></w:r></w:p> <w:p><w:r><w:t>ii. Dalam masa {{PaymentWindowDays}} hari dari tarikh surat ini pihak Tuan/Puan mengeluarkan dan menerbitkan satu akujanji kepada Anakguam kami bahawa pihak Tuan/Puan tidak akan membuat Pernyataan-Pernyataan Fitnah tersebut lagi ke atas Anakguam kami secara awam dan/atau melalui mana-mana laman sosial.</w:t></w:r></w:p> <w:p><w:r><w:t></w:t></w:r></w:p> <w:p><w:r><w:t>iii. Dalam masa {{PaymentWindowDays}} hari dari tarikh surat ini pihak Tuan/Puan mengeluarkan dan menerbitkan draf permohonan maaf secara video dan bertulis kepada pihak kami.</w:t></w:r></w:p> <w:p><w:r><w:t></w:t></w:r></w:p> <w:p><w:r><w:t>iv. Selepas pihak kami meluluskan draf permohonan maaf secara video dan bertulis tersebut, permohonan maaf tersebut hendaklah dimuat naik di semua akaun media sosial milik Tuan/Puan termasuk akaun {{MainSocialAccount}} dan ditetapkan secara umum (public) selama-lamanya.</w:t></w:r></w:p> <w:p><w:r><w:t></w:t></w:r></w:p> <w:p><w:r><w:t>v. Dalam masa {{PaymentWindowDays}} hari dari tarikh surat ini pihak Tuan/Puan membayar kepada Anakguam kami atau kami sebagai peguam cara bagi Anakguam kami gantirugi sebanyak {{Currency}} {{AmountDue}} atas Pernyataan-Pernyataan Fitnah tersebut oleh pihak Tuan/Puan ke atas Anakguam kami.</w:t></w:r></w:p> <w:p><w:r><w:t></w:t></w:r></w:p> <w:p><w:r><w:t>SILA AMBIL PERHATIAN SETERUSNYA bahawa tuntutan-tuntutan di atas dibuat tanpa prasangka ke atas hak-hak dan remedi yang tersedia kepada Anakguam kami. Jika pihak Tuan/Puan gagal dan enggan untuk berbuat sedemikian, maka kami mempunyai arahan tegas Anakguam kami untuk memfailkan tindakan sivil di Mahkamah tanpa notis lanjut.</w:t></w:r></w:p> <w:p><w:r><w:t></w:t></w:r></w:p> <w:p><w:r><w:t>Sila nyatakan rujukan kami apabila membalas.</w:t></w:r></w:p> <w:p><w:r><w:t></w:t></w:r></w:p> <w:p><w:r><w:t>Yang benar,</w:t></w:r></w:p> <w:p><w:r><w:t></w:t></w:r></w:p> <w:p><w:r><w:t>{{senderName}}</w:t></w:r></w:p> <w:p><w:r><w:t>{{YourSignerTitle}}</w:t></w:r></w:p></w:document>
 </file>
 
 <file path=word\fontTable.xml><?xml version="1.0" encoding="utf-8"?>

</xml_diff>